<commit_message>
Proje dosyasındaki keyler ve idler env dosyasına alındı
</commit_message>
<xml_diff>
--- a/agreement_output.docx
+++ b/agreement_output.docx
@@ -7,7 +7,7 @@
         <w:pStyle w:val="Title"/>
       </w:pPr>
       <w:r>
-        <w:t>Kurumsal Web Uygulama Geliştirme Sözleşmesi</w:t>
+        <w:t>Kredi Başvuru Süreç Otomasyonu Geliştirme Projesi Sözleşmesi</w:t>
       </w:r>
     </w:p>
     <w:p>
@@ -25,12 +25,12 @@
     </w:p>
     <w:p>
       <w:r>
-        <w:t>Alıcı: Örnek Teknoloji A.Ş.</w:t>
+        <w:t>Alıcı: BANKA ADI</w:t>
       </w:r>
     </w:p>
     <w:p>
       <w:r>
-        <w:t>Tedarikçi/Satıcı: Proje Teklifini Sunan Firma</w:t>
+        <w:t>Tedarikçi/Satıcı: Tedarikçi/Satıcı Adı</w:t>
       </w:r>
     </w:p>
     <w:p>
@@ -51,7 +51,7 @@
     </w:p>
     <w:p>
       <w:r>
-        <w:t>Bu sözleşme, bir tarafta Örnek Teknoloji A.Ş. (Alıcı) ile diğer tarafta Proje Teklifini Sunan Firma (Tedarikçi) arasında, kurumsal web uygulama geliştirme projesine ilişkin ilişkiyi ve tarafların rollerini düzenler.</w:t>
+        <w:t>Bu sözleşme, Kredi Başvuru Süreç Otomasyonu Geliştirme Projesi kapsamında BANKA ADI (alıcı) ile Tedarikçi/Satıcı Adı (tedarikçi) arasında, tarafların rollerini ve projeye ilişkin yükümlülüklerini tanımlamak üzere imzalanmaktadır.</w:t>
       </w:r>
     </w:p>
     <w:p>
@@ -64,7 +64,7 @@
     </w:p>
     <w:p>
       <w:r>
-        <w:t>Sözleşmenin konusu, müşteri gereksinimlerine uygun, bulut tabanlı, modern, güvenli ve fonksiyonel bir web uygulamasının geliştirilerek teslim edilmesidir. Proje; kullanıcı/rol yönetimi, raporlama, dashboard, teknik destek ve admin fonksiyonları, veri entegrasyonları, sistem yedekleme ve felaket kurtarma mekanizmaları ile test, eğitim ve teslim dokümantasyonlarını kapsar.</w:t>
+        <w:t>Sözleşmenin konusu, banka tarafından yürütülen kredi başvuru ve değerlendirme süreçlerini tamamen dijitalleştirmek, otomasyon sağlamak ve kullanıcı rolleri üzerinden kontrollü erişimleri yöneten web tabanlı bir platformun dış kaynak (tedarikçi) tarafından analiz, tasarım, geliştirme, test, devreye alma ve bakım dahil uçtan uca gerçekleştirilmesidir.</w:t>
       </w:r>
     </w:p>
     <w:p>
@@ -77,7 +77,7 @@
     </w:p>
     <w:p>
       <w:r>
-        <w:t>Teklif teslim tarihi 01.07.2024; proje teslim tarihi 01.10.2024'tür. Tüm modüller belirtilen tarihte eksiksiz teslim edilecektir. Uygulama için %99,5 erişilebilirlik ve yüksek performans taahhüt edilmektedir. Garanti süresi boyunca tespit edilen hatalar ücretsiz, makul sürelerde giderilecektir.</w:t>
+        <w:t>Proje teslim süresi 3 aydır ve proje teslimi en geç 2024-10-15 tarihinde tamamlanacaktır. Teslimat kapsamı, testlerin en az %80 başarı oranı ile tamamlanmasını ve sistemin canlıya alınmasını içerir. Tedarikçi teslimden sonra bakım ve destek sağlayacaktır. Sistem ISO 27001, KVKK ve GDPR uyumlu olacak; yüksek erişilebilirlik, ölçeklenebilirlik ve yedekleme desteği sağlanacaktır.</w:t>
       </w:r>
     </w:p>
     <w:p>
@@ -90,7 +90,7 @@
     </w:p>
     <w:p>
       <w:r>
-        <w:t>Fiyatlandırma her bir iş kalemi özelinde ayrıştırılarak ve şeffaf biçimde hazırlanacaktır. Her bir teslimat yürürlüğe girdikçe, ilgili kalem üzerinden faturalandırma ve ödeme yapılacaktır. En yüksek fiyat limiti bulunmamaktadır; tüm ödeme ve faturalama işlemleri proje dökümanlarında belirtilen tabloya uygun şekilde yürütülür.</w:t>
+        <w:t>Sözleşmeye konu işlerin toplam bedeli 1.000.000 TL (KDV hariç) olarak belirlenmiştir. Ödeme takvimi, belirlenen proje aşamalarının tamamlanmasına ve teslimat gereksinimlerinin yerine getirilmesine bağlı olarak gerçekleştirilecektir.</w:t>
       </w:r>
     </w:p>
     <w:p>
@@ -103,7 +103,7 @@
     </w:p>
     <w:p>
       <w:r>
-        <w:t>Proje kapsamında geliştirilen yazılımın ve çıktılarının fikri mülkiyet hakları açıkça tanımlanacaktır. Anahtar teslim yazılımlar ve özgün geliştirmelerde, kaynak kodların ve dokümantasyonların mülkiyeti Alıcı'ya ait olup, Tedarikçi yalnızca projede kullanılmak üzere gerekli haklara sahip olabilecektir. Üçüncü parti yazılımlar ve lisanslar ayrıca bildirilecektir.</w:t>
+        <w:t>Proje kapsamında geliştirilen yazılım, kodlar, dokümantasyon ve tüm çıktılar bankanın (alıcı) mülkiyetine geçer. Tedarikçi, açıkça belirtilmediği sürece kaynak kodu üzerinde herhangi bir hak iddia edemez. Üçüncü parti bileşenler açıkça listelenecek ve kullanım hakları belirtilecektir.</w:t>
       </w:r>
     </w:p>
     <w:p>
@@ -116,7 +116,7 @@
     </w:p>
     <w:p>
       <w:r>
-        <w:t>Sözleşmede işlenen tüm verilerin KVKK ve/veya GDPR kapsamında korunması ve işlenmesi gereklerini Tedarikçi sağlayacak, gizlilik yükümlülükleri iki taraf için de geçerli olacaktır. Tüm taraflar; kişisel, ticari ve proje bilgilerinin gizliliğini koruma sorumluluğundadır.</w:t>
+        <w:t>Proje, ISO 27001, KVKK ve GDPR mevzuatı ile tam uyumluluk sağlayacaktır. Tüm taraflar, müşteri verisi ve ilgili tüm proje bilgilerini gizli tutacaktır. Yasal zorunluluklar dışında herhangi bir bilgi üçüncü kişiler ile paylaşılmayacaktır.</w:t>
       </w:r>
     </w:p>
     <w:p>
@@ -129,7 +129,7 @@
     </w:p>
     <w:p>
       <w:r>
-        <w:t>Tedarikçi, projede alt yüklenici veya üçüncü parti yazılım ve servislerden faydalanmak isterse, bunu önceden Alıcı’ya yazılı olarak bildirmek ve onayını almak zorundadır. Alt yükleniciler bakımından asıl sorumluluk Tedarikçi'de kalacaktır.</w:t>
+        <w:t>Tedarikçi, projede alt yüklenici veya üçüncü taraf bileşen kullanacaksa bunları önceden yazılı olarak bildirmek ve alıcı ile mutabık kalmak zorundadır. Kullanılan tüm harici teknolojiler ve hizmetler açıkça sayılmalı ve uyumluluklarından tedarikçi sorumludur.</w:t>
       </w:r>
     </w:p>
     <w:p>
@@ -142,7 +142,7 @@
     </w:p>
     <w:p>
       <w:r>
-        <w:t>Kullanıcı senaryolarındaki değişiklikler, mevzuat güncellemeleri veya üçüncü parti entegrasyon aksaklıklarından kaynaklanan ve öngörülemeyen riskler karşısında taraflar iyi niyetle çözüm arayacak; teslim ve kullanıcı kabul testlerinde ek gereksinim çıkması halinde ek protokol yapılabilecektir. Sözleşmenin feshi için; açık şekilde teslimata uyulmaması, yasal uyum eksikliği veya ağır ihlal hallerinde her iki tarafa da hak tanınır. Fesih sonrası teslimatların ve kapanış prosedürlerinin adımlarına sözleşmede ayrıca yer verilir.</w:t>
+        <w:t>Proje süresinin kısalığı, entegrasyon karmaşıklığı ve yüksek güvenlik gereklilikleri gibi risklerin yönetimi tedarikçiye aittir. Sözleşme yükümlülüklerinin ihlali, teslimatların tamamlanmaması veya yasal/mevzuata aykırı bir durum halinde taraflardan biri sözleşmeyi tek taraflı olarak feshedebilir. Fesih halinde teslim edilen işler için ödeme hesaplanır ve kalan işler için herhangi bir sorumluluk doğmaz. Proje kapanışı ve devir teslim için yazılı tutanak düzenlenecektir.</w:t>
       </w:r>
     </w:p>
     <w:p>
@@ -155,7 +155,7 @@
     </w:p>
     <w:p>
       <w:r>
-        <w:t>Her maddenin sözleşmede yer almasının sebebi; taraf rollerinin şeffaf belirlenmesi (1), projenin fonksiyonel çerçevesinin netleştirilmesi (2), zaman-maliyet-kalite beklentisinin kesinleştirilmesi (3-4), oluşacak çıktılarda mülkiyet sorunlarının önlenmesi (5), yasal ve etik yükümlülüklerin karşılandığının garanti edilmesi (6), dış kaynak kullanımı risklerinin yönetilmesi (7), proje boyunca doğabilecek risklere karşı önceden mekanizma belirlenmesi ve ticari ilişkinin mimarisinin güçlü şekilde kurulmasıdır (8).</w:t>
+        <w:t>1. Tarafların ve rollerinin netleştirilmesi projede sorumlulukların şeffaf olmasını sağlar. 2. Hizmet tanımı, kapsam belirsizliğini engeller. 3. Süre, teslimat ve garanti maddeleri, projede hedeflenen tamamlanma takvimi ve kaliteyi güvence altına alır. 4. Ücret ve ödeme planı, mali uyumu sağlar ve taraflar arasındaki iş ilişkisini düzenler. 5. Fikri mülkiyetin düzenlenmesi, tarafların yasal haklarının korunmasını ve ileride anlaşmazlıkların önlenmesini temin eder. 6. Yasal uyum ve gizlilik, regulasyon zorunlulukları ve müşteri güvenliği için gereklidir. 7. Alt yüklenici maddesi, projede dış kaynak kullanımında şeffaflığı sağlar. 8. Risk ve fesih hükümleri, projede çıkabilecek pürüzlere karşı çözüm yönlendirir ve tarafları korur.</w:t>
       </w:r>
     </w:p>
     <w:p>
@@ -168,7 +168,7 @@
     </w:p>
     <w:p>
       <w:r>
-        <w:t>Alıcı: Örnek Teknoloji A.Ş.</w:t>
+        <w:t>Alıcı: BANKA ADI</w:t>
       </w:r>
     </w:p>
     <w:p>
@@ -184,7 +184,7 @@
     <w:p/>
     <w:p>
       <w:r>
-        <w:t>Tedarikçi/Satıcı: Proje Teklifini Sunan Firma</w:t>
+        <w:t>Tedarikçi/Satıcı: Tedarikçi/Satıcı Adı</w:t>
       </w:r>
     </w:p>
     <w:p>

</xml_diff>